<commit_message>
feat: return download docx file success
</commit_message>
<xml_diff>
--- a/backend/src/backend.Api/rag_outputs/Replybrary_Overview.docx
+++ b/backend/src/backend.Api/rag_outputs/Replybrary_Overview.docx
@@ -34,7 +34,7 @@
         <w:pStyle w:val="Heading1"/>
       </w:pPr>
       <w:r>
-        <w:t xml:space="preserve">Solution overview</w:t>
+        <w:t xml:space="preserve">Solution Overview</w:t>
       </w:r>
     </w:p>
     <w:bookmarkStart w:id="9" w:name="key-counts"/>
@@ -89,13 +89,13 @@
       </w:r>
     </w:p>
     <w:bookmarkEnd w:id="9"/>
-    <w:bookmarkStart w:id="10" w:name="workflows-10-source-workflows.json"/>
+    <w:bookmarkStart w:id="10" w:name="canvas-app-groups"/>
     <w:p>
       <w:pPr>
         <w:pStyle w:val="Heading2"/>
       </w:pPr>
       <w:r>
-        <w:t xml:space="preserve">Workflows (10) — source: workflows.json</w:t>
+        <w:t xml:space="preserve">Canvas app groups</w:t>
       </w:r>
     </w:p>
     <w:p>
@@ -107,6 +107,43 @@
         </w:numPr>
       </w:pPr>
       <w:r>
+        <w:t xml:space="preserve">wmreply_replybraryv2_c933c</w:t>
+      </w:r>
+      <w:r>
+        <w:br/>
+      </w:r>
+    </w:p>
+    <w:p>
+      <w:pPr>
+        <w:pStyle w:val="Compact"/>
+        <w:numPr>
+          <w:ilvl w:val="0"/>
+          <w:numId w:val="1002"/>
+        </w:numPr>
+      </w:pPr>
+      <w:r>
+        <w:t xml:space="preserve">wmreply_replybrary_b320d</w:t>
+      </w:r>
+    </w:p>
+    <w:bookmarkEnd w:id="10"/>
+    <w:bookmarkStart w:id="11" w:name="workflows"/>
+    <w:p>
+      <w:pPr>
+        <w:pStyle w:val="Heading2"/>
+      </w:pPr>
+      <w:r>
+        <w:t xml:space="preserve">Workflows</w:t>
+      </w:r>
+    </w:p>
+    <w:p>
+      <w:pPr>
+        <w:pStyle w:val="Compact"/>
+        <w:numPr>
+          <w:ilvl w:val="0"/>
+          <w:numId w:val="1003"/>
+        </w:numPr>
+      </w:pPr>
+      <w:r>
         <w:t xml:space="preserve">EndFormFlow-82921763-2342-F011-8779-000D3A0CEB69.json</w:t>
       </w:r>
       <w:r>
@@ -118,7 +155,7 @@
         <w:pStyle w:val="Compact"/>
         <w:numPr>
           <w:ilvl w:val="0"/>
-          <w:numId w:val="1002"/>
+          <w:numId w:val="1003"/>
         </w:numPr>
       </w:pPr>
       <w:r>
@@ -133,7 +170,7 @@
         <w:pStyle w:val="Compact"/>
         <w:numPr>
           <w:ilvl w:val="0"/>
-          <w:numId w:val="1002"/>
+          <w:numId w:val="1003"/>
         </w:numPr>
       </w:pPr>
       <w:r>
@@ -148,7 +185,7 @@
         <w:pStyle w:val="Compact"/>
         <w:numPr>
           <w:ilvl w:val="0"/>
-          <w:numId w:val="1002"/>
+          <w:numId w:val="1003"/>
         </w:numPr>
       </w:pPr>
       <w:r>
@@ -163,7 +200,7 @@
         <w:pStyle w:val="Compact"/>
         <w:numPr>
           <w:ilvl w:val="0"/>
-          <w:numId w:val="1002"/>
+          <w:numId w:val="1003"/>
         </w:numPr>
       </w:pPr>
       <w:r>
@@ -178,7 +215,7 @@
         <w:pStyle w:val="Compact"/>
         <w:numPr>
           <w:ilvl w:val="0"/>
-          <w:numId w:val="1002"/>
+          <w:numId w:val="1003"/>
         </w:numPr>
       </w:pPr>
       <w:r>
@@ -193,7 +230,7 @@
         <w:pStyle w:val="Compact"/>
         <w:numPr>
           <w:ilvl w:val="0"/>
-          <w:numId w:val="1002"/>
+          <w:numId w:val="1003"/>
         </w:numPr>
       </w:pPr>
       <w:r>
@@ -208,7 +245,7 @@
         <w:pStyle w:val="Compact"/>
         <w:numPr>
           <w:ilvl w:val="0"/>
-          <w:numId w:val="1002"/>
+          <w:numId w:val="1003"/>
         </w:numPr>
       </w:pPr>
       <w:r>
@@ -223,7 +260,7 @@
         <w:pStyle w:val="Compact"/>
         <w:numPr>
           <w:ilvl w:val="0"/>
-          <w:numId w:val="1002"/>
+          <w:numId w:val="1003"/>
         </w:numPr>
       </w:pPr>
       <w:r>
@@ -238,29 +275,29 @@
         <w:pStyle w:val="Compact"/>
         <w:numPr>
           <w:ilvl w:val="0"/>
-          <w:numId w:val="1002"/>
+          <w:numId w:val="1003"/>
         </w:numPr>
       </w:pPr>
       <w:r>
         <w:t xml:space="preserve">UploadLogo-F9309D25-C742-F011-877A-000D3A0CEB69.json</w:t>
       </w:r>
     </w:p>
-    <w:bookmarkEnd w:id="10"/>
-    <w:bookmarkStart w:id="11" w:name="Xaae7e673381ddc41d60f565ce8b9a3b59e04435"/>
+    <w:bookmarkEnd w:id="11"/>
+    <w:bookmarkStart w:id="12" w:name="environment-variables-names"/>
     <w:p>
       <w:pPr>
         <w:pStyle w:val="Heading2"/>
       </w:pPr>
       <w:r>
-        <w:t xml:space="preserve">Environment variables (names, 16) — source: envvars.json</w:t>
-      </w:r>
-    </w:p>
-    <w:p>
-      <w:pPr>
-        <w:pStyle w:val="Compact"/>
-        <w:numPr>
-          <w:ilvl w:val="0"/>
-          <w:numId w:val="1003"/>
+        <w:t xml:space="preserve">Environment variables (names)</w:t>
+      </w:r>
+    </w:p>
+    <w:p>
+      <w:pPr>
+        <w:pStyle w:val="Compact"/>
+        <w:numPr>
+          <w:ilvl w:val="0"/>
+          <w:numId w:val="1004"/>
         </w:numPr>
       </w:pPr>
       <w:r>
@@ -275,7 +312,7 @@
         <w:pStyle w:val="Compact"/>
         <w:numPr>
           <w:ilvl w:val="0"/>
-          <w:numId w:val="1003"/>
+          <w:numId w:val="1004"/>
         </w:numPr>
       </w:pPr>
       <w:r>
@@ -290,7 +327,7 @@
         <w:pStyle w:val="Compact"/>
         <w:numPr>
           <w:ilvl w:val="0"/>
-          <w:numId w:val="1003"/>
+          <w:numId w:val="1004"/>
         </w:numPr>
       </w:pPr>
       <w:r>
@@ -305,7 +342,7 @@
         <w:pStyle w:val="Compact"/>
         <w:numPr>
           <w:ilvl w:val="0"/>
-          <w:numId w:val="1003"/>
+          <w:numId w:val="1004"/>
         </w:numPr>
       </w:pPr>
       <w:r>
@@ -320,7 +357,7 @@
         <w:pStyle w:val="Compact"/>
         <w:numPr>
           <w:ilvl w:val="0"/>
-          <w:numId w:val="1003"/>
+          <w:numId w:val="1004"/>
         </w:numPr>
       </w:pPr>
       <w:r>
@@ -335,7 +372,7 @@
         <w:pStyle w:val="Compact"/>
         <w:numPr>
           <w:ilvl w:val="0"/>
-          <w:numId w:val="1003"/>
+          <w:numId w:val="1004"/>
         </w:numPr>
       </w:pPr>
       <w:r>
@@ -350,7 +387,7 @@
         <w:pStyle w:val="Compact"/>
         <w:numPr>
           <w:ilvl w:val="0"/>
-          <w:numId w:val="1003"/>
+          <w:numId w:val="1004"/>
         </w:numPr>
       </w:pPr>
       <w:r>
@@ -365,7 +402,7 @@
         <w:pStyle w:val="Compact"/>
         <w:numPr>
           <w:ilvl w:val="0"/>
-          <w:numId w:val="1003"/>
+          <w:numId w:val="1004"/>
         </w:numPr>
       </w:pPr>
       <w:r>
@@ -380,7 +417,7 @@
         <w:pStyle w:val="Compact"/>
         <w:numPr>
           <w:ilvl w:val="0"/>
-          <w:numId w:val="1003"/>
+          <w:numId w:val="1004"/>
         </w:numPr>
       </w:pPr>
       <w:r>
@@ -395,7 +432,7 @@
         <w:pStyle w:val="Compact"/>
         <w:numPr>
           <w:ilvl w:val="0"/>
-          <w:numId w:val="1003"/>
+          <w:numId w:val="1004"/>
         </w:numPr>
       </w:pPr>
       <w:r>
@@ -410,7 +447,7 @@
         <w:pStyle w:val="Compact"/>
         <w:numPr>
           <w:ilvl w:val="0"/>
-          <w:numId w:val="1003"/>
+          <w:numId w:val="1004"/>
         </w:numPr>
       </w:pPr>
       <w:r>
@@ -425,7 +462,7 @@
         <w:pStyle w:val="Compact"/>
         <w:numPr>
           <w:ilvl w:val="0"/>
-          <w:numId w:val="1003"/>
+          <w:numId w:val="1004"/>
         </w:numPr>
       </w:pPr>
       <w:r>
@@ -440,7 +477,7 @@
         <w:pStyle w:val="Compact"/>
         <w:numPr>
           <w:ilvl w:val="0"/>
-          <w:numId w:val="1003"/>
+          <w:numId w:val="1004"/>
         </w:numPr>
       </w:pPr>
       <w:r>
@@ -455,7 +492,7 @@
         <w:pStyle w:val="Compact"/>
         <w:numPr>
           <w:ilvl w:val="0"/>
-          <w:numId w:val="1003"/>
+          <w:numId w:val="1004"/>
         </w:numPr>
       </w:pPr>
       <w:r>
@@ -470,7 +507,7 @@
         <w:pStyle w:val="Compact"/>
         <w:numPr>
           <w:ilvl w:val="0"/>
-          <w:numId w:val="1003"/>
+          <w:numId w:val="1004"/>
         </w:numPr>
       </w:pPr>
       <w:r>
@@ -485,48 +522,19 @@
         <w:pStyle w:val="Compact"/>
         <w:numPr>
           <w:ilvl w:val="0"/>
-          <w:numId w:val="1003"/>
+          <w:numId w:val="1004"/>
         </w:numPr>
       </w:pPr>
       <w:r>
         <w:t xml:space="preserve">wmreply_Replybrary_SP_Site/</w:t>
       </w:r>
     </w:p>
-    <w:bookmarkEnd w:id="11"/>
-    <w:bookmarkStart w:id="12" w:name="X3b69630ca04a98352a2bd2fac4b913e69779551"/>
-    <w:p>
-      <w:pPr>
-        <w:pStyle w:val="Heading2"/>
-      </w:pPr>
-      <w:r>
-        <w:t xml:space="preserve">Canvas app groups (2) — source: canvasapps.json</w:t>
-      </w:r>
-    </w:p>
-    <w:p>
-      <w:pPr>
-        <w:pStyle w:val="Compact"/>
-        <w:numPr>
-          <w:ilvl w:val="0"/>
-          <w:numId w:val="1004"/>
-        </w:numPr>
-      </w:pPr>
-      <w:r>
-        <w:t xml:space="preserve">wmreply_replybraryv2_c933c</w:t>
-      </w:r>
-      <w:r>
-        <w:br/>
-      </w:r>
-    </w:p>
-    <w:p>
-      <w:pPr>
-        <w:pStyle w:val="Compact"/>
-        <w:numPr>
-          <w:ilvl w:val="0"/>
-          <w:numId w:val="1004"/>
-        </w:numPr>
-      </w:pPr>
-      <w:r>
-        <w:t xml:space="preserve">wmreply_replybrary_b320d</w:t>
+    <w:p>
+      <w:pPr>
+        <w:pStyle w:val="FirstParagraph"/>
+      </w:pPr>
+      <w:r>
+        <w:t xml:space="preserve">(All items above are taken directly from the uploaded solution chunks.)</w:t>
       </w:r>
     </w:p>
     <w:bookmarkEnd w:id="12"/>

</xml_diff>

<commit_message>
fix: accept multiple output file types and return based on order
</commit_message>
<xml_diff>
--- a/backend/src/backend.Api/rag_outputs/Replybrary_Overview.docx
+++ b/backend/src/backend.Api/rag_outputs/Replybrary_Overview.docx
@@ -37,13 +37,13 @@
         <w:t xml:space="preserve">Solution overview</w:t>
       </w:r>
     </w:p>
-    <w:bookmarkStart w:id="9" w:name="key-counts-from-overview.json"/>
+    <w:bookmarkStart w:id="9" w:name="key-counts"/>
     <w:p>
       <w:pPr>
         <w:pStyle w:val="Heading2"/>
       </w:pPr>
       <w:r>
-        <w:t xml:space="preserve">Key counts (from overview.json)</w:t>
+        <w:t xml:space="preserve">Key counts</w:t>
       </w:r>
     </w:p>
     <w:p>
@@ -246,13 +246,13 @@
       </w:r>
     </w:p>
     <w:bookmarkEnd w:id="10"/>
-    <w:bookmarkStart w:id="11" w:name="X943754e4eb1399ed92e9ee5e9c17d8dd48a11b2"/>
+    <w:bookmarkStart w:id="11" w:name="Xf300e3036b2b26d6480dd57158083c7ef34c15c"/>
     <w:p>
       <w:pPr>
         <w:pStyle w:val="Heading2"/>
       </w:pPr>
       <w:r>
-        <w:t xml:space="preserve">Environment variables (16) — source: envvars.json</w:t>
+        <w:t xml:space="preserve">Environment variable names (16) — source: envvars.json</w:t>
       </w:r>
     </w:p>
     <w:p>

</xml_diff>

<commit_message>
chore(docker): add Dockerfile.dev for backend
</commit_message>
<xml_diff>
--- a/backend/src/backend.Api/rag_outputs/Replybrary_Overview.docx
+++ b/backend/src/backend.Api/rag_outputs/Replybrary_Overview.docx
@@ -246,13 +246,13 @@
       </w:r>
     </w:p>
     <w:bookmarkEnd w:id="10"/>
-    <w:bookmarkStart w:id="11" w:name="Xf300e3036b2b26d6480dd57158083c7ef34c15c"/>
+    <w:bookmarkStart w:id="11" w:name="X9f14f692452f04c4889a49c35c859e836638221"/>
     <w:p>
       <w:pPr>
         <w:pStyle w:val="Heading2"/>
       </w:pPr>
       <w:r>
-        <w:t xml:space="preserve">Environment variable names (16) — source: envvars.json</w:t>
+        <w:t xml:space="preserve">Environment variables (names) — source: envvars.json</w:t>
       </w:r>
     </w:p>
     <w:p>

</xml_diff>

<commit_message>
refactor: integrate Dara's new parser code
</commit_message>
<xml_diff>
--- a/backend/src/backend.Api/rag_outputs/Replybrary_Overview.docx
+++ b/backend/src/backend.Api/rag_outputs/Replybrary_Overview.docx
@@ -28,7 +28,7 @@
         </w:p>
       </w:sdtContent>
     </w:sdt>
-    <w:bookmarkStart w:id="13" w:name="solution-overview"/>
+    <w:bookmarkStart w:id="14" w:name="solution-overview"/>
     <w:p>
       <w:pPr>
         <w:pStyle w:val="Heading1"/>
@@ -37,13 +37,13 @@
         <w:t xml:space="preserve">Solution overview</w:t>
       </w:r>
     </w:p>
-    <w:bookmarkStart w:id="9" w:name="key-counts"/>
+    <w:bookmarkStart w:id="9" w:name="counts"/>
     <w:p>
       <w:pPr>
         <w:pStyle w:val="Heading2"/>
       </w:pPr>
       <w:r>
-        <w:t xml:space="preserve">Key counts</w:t>
+        <w:t xml:space="preserve">Counts</w:t>
       </w:r>
     </w:p>
     <w:p>
@@ -55,6 +55,21 @@
         </w:numPr>
       </w:pPr>
       <w:r>
+        <w:t xml:space="preserve">Canvas apps: 2</w:t>
+      </w:r>
+      <w:r>
+        <w:br/>
+      </w:r>
+    </w:p>
+    <w:p>
+      <w:pPr>
+        <w:pStyle w:val="Compact"/>
+        <w:numPr>
+          <w:ilvl w:val="0"/>
+          <w:numId w:val="1001"/>
+        </w:numPr>
+      </w:pPr>
+      <w:r>
         <w:t xml:space="preserve">Workflows: 10</w:t>
       </w:r>
       <w:r>
@@ -85,452 +100,587 @@
         </w:numPr>
       </w:pPr>
       <w:r>
-        <w:t xml:space="preserve">Canvas app groups: 2</w:t>
+        <w:t xml:space="preserve">Screens: 0 (no screens found in the canvas apps)</w:t>
+      </w:r>
+      <w:r>
+        <w:br/>
+      </w:r>
+    </w:p>
+    <w:p>
+      <w:pPr>
+        <w:pStyle w:val="Compact"/>
+        <w:numPr>
+          <w:ilvl w:val="0"/>
+          <w:numId w:val="1001"/>
+        </w:numPr>
+      </w:pPr>
+      <w:r>
+        <w:t xml:space="preserve">Relationship edges (total): 44</w:t>
+      </w:r>
+    </w:p>
+    <w:p>
+      <w:pPr>
+        <w:pStyle w:val="Compact"/>
+        <w:numPr>
+          <w:ilvl w:val="1"/>
+          <w:numId w:val="1002"/>
+        </w:numPr>
+      </w:pPr>
+      <w:r>
+        <w:t xml:space="preserve">workflow_to_connector: 18 (workflow connector edges)</w:t>
+      </w:r>
+      <w:r>
+        <w:br/>
+      </w:r>
+    </w:p>
+    <w:p>
+      <w:pPr>
+        <w:pStyle w:val="Compact"/>
+        <w:numPr>
+          <w:ilvl w:val="1"/>
+          <w:numId w:val="1002"/>
+        </w:numPr>
+      </w:pPr>
+      <w:r>
+        <w:t xml:space="preserve">workflow_to_env: 26 (remaining relationships → workflows to env vars; 44 total − 18 connector edges = 26)</w:t>
       </w:r>
     </w:p>
     <w:bookmarkEnd w:id="9"/>
-    <w:bookmarkStart w:id="10" w:name="workflows-10-source-workflows.json"/>
+    <w:bookmarkStart w:id="10" w:name="connectors-used-unique"/>
     <w:p>
       <w:pPr>
         <w:pStyle w:val="Heading2"/>
       </w:pPr>
       <w:r>
-        <w:t xml:space="preserve">Workflows (10) — source: workflows.json</w:t>
-      </w:r>
-    </w:p>
-    <w:p>
-      <w:pPr>
-        <w:pStyle w:val="Compact"/>
-        <w:numPr>
-          <w:ilvl w:val="0"/>
-          <w:numId w:val="1002"/>
-        </w:numPr>
-      </w:pPr>
-      <w:r>
-        <w:t xml:space="preserve">EndFormFlow-82921763-2342-F011-8779-000D3A0CEB69.json</w:t>
-      </w:r>
-      <w:r>
-        <w:br/>
-      </w:r>
-    </w:p>
-    <w:p>
-      <w:pPr>
-        <w:pStyle w:val="Compact"/>
-        <w:numPr>
-          <w:ilvl w:val="0"/>
-          <w:numId w:val="1002"/>
-        </w:numPr>
-      </w:pPr>
-      <w:r>
-        <w:t xml:space="preserve">EndFormFlowReminder-128F82AA-B942-F011-877A-000D3A0CEB69.json</w:t>
-      </w:r>
-      <w:r>
-        <w:br/>
-      </w:r>
-    </w:p>
-    <w:p>
-      <w:pPr>
-        <w:pStyle w:val="Compact"/>
-        <w:numPr>
-          <w:ilvl w:val="0"/>
-          <w:numId w:val="1002"/>
-        </w:numPr>
-      </w:pPr>
-      <w:r>
-        <w:t xml:space="preserve">IdentifierReminderFlow-D4AE74B0-DA42-F011-877A-000D3A0CEB69.json</w:t>
-      </w:r>
-      <w:r>
-        <w:br/>
-      </w:r>
-    </w:p>
-    <w:p>
-      <w:pPr>
-        <w:pStyle w:val="Compact"/>
-        <w:numPr>
-          <w:ilvl w:val="0"/>
-          <w:numId w:val="1002"/>
-        </w:numPr>
-      </w:pPr>
-      <w:r>
-        <w:t xml:space="preserve">PeopleListFlow-3CE0853C-4C36-F011-8C4C-6045BD0ACADB.json</w:t>
-      </w:r>
-      <w:r>
-        <w:br/>
-      </w:r>
-    </w:p>
-    <w:p>
-      <w:pPr>
-        <w:pStyle w:val="Compact"/>
-        <w:numPr>
-          <w:ilvl w:val="0"/>
-          <w:numId w:val="1002"/>
-        </w:numPr>
-      </w:pPr>
-      <w:r>
-        <w:t xml:space="preserve">PMflow-A3194D5E-D434-F011-8C4C-6045BD0ACADB.json</w:t>
-      </w:r>
-      <w:r>
-        <w:br/>
-      </w:r>
-    </w:p>
-    <w:p>
-      <w:pPr>
-        <w:pStyle w:val="Compact"/>
-        <w:numPr>
-          <w:ilvl w:val="0"/>
-          <w:numId w:val="1002"/>
-        </w:numPr>
-      </w:pPr>
-      <w:r>
-        <w:t xml:space="preserve">PMFormReminderFlow-B025C04D-D342-F011-877A-000D3A0CEB69.json</w:t>
-      </w:r>
-      <w:r>
-        <w:br/>
-      </w:r>
-    </w:p>
-    <w:p>
-      <w:pPr>
-        <w:pStyle w:val="Compact"/>
-        <w:numPr>
-          <w:ilvl w:val="0"/>
-          <w:numId w:val="1002"/>
-        </w:numPr>
-      </w:pPr>
-      <w:r>
-        <w:t xml:space="preserve">ReplybraryDailyPipedrivecheck-5898F434-A147-F011-8779-000D3A0CEB69.json</w:t>
-      </w:r>
-      <w:r>
-        <w:br/>
-      </w:r>
-    </w:p>
-    <w:p>
-      <w:pPr>
-        <w:pStyle w:val="Compact"/>
-        <w:numPr>
-          <w:ilvl w:val="0"/>
-          <w:numId w:val="1002"/>
-        </w:numPr>
-      </w:pPr>
-      <w:r>
-        <w:t xml:space="preserve">Replybrary_GetExchangeRate-4E437A2B-C74D-F011-877B-000D3A0CEB69.json</w:t>
-      </w:r>
-      <w:r>
-        <w:br/>
-      </w:r>
-    </w:p>
-    <w:p>
-      <w:pPr>
-        <w:pStyle w:val="Compact"/>
-        <w:numPr>
-          <w:ilvl w:val="0"/>
-          <w:numId w:val="1002"/>
-        </w:numPr>
-      </w:pPr>
-      <w:r>
-        <w:t xml:space="preserve">Replybrary_Identifier_Flow-38CA161E-BA34-F011-8C4C-6045BD0ACADB.json</w:t>
-      </w:r>
-      <w:r>
-        <w:br/>
-      </w:r>
-    </w:p>
-    <w:p>
-      <w:pPr>
-        <w:pStyle w:val="Compact"/>
-        <w:numPr>
-          <w:ilvl w:val="0"/>
-          <w:numId w:val="1002"/>
-        </w:numPr>
-      </w:pPr>
-      <w:r>
-        <w:t xml:space="preserve">UploadLogo-F9309D25-C742-F011-877A-000D3A0CEB69.json</w:t>
+        <w:t xml:space="preserve">Connectors used (unique)</w:t>
+      </w:r>
+    </w:p>
+    <w:p>
+      <w:pPr>
+        <w:pStyle w:val="Compact"/>
+        <w:numPr>
+          <w:ilvl w:val="0"/>
+          <w:numId w:val="1003"/>
+        </w:numPr>
+      </w:pPr>
+      <w:r>
+        <w:t xml:space="preserve">shared_sharepointonline</w:t>
+      </w:r>
+      <w:r>
+        <w:br/>
+      </w:r>
+    </w:p>
+    <w:p>
+      <w:pPr>
+        <w:pStyle w:val="Compact"/>
+        <w:numPr>
+          <w:ilvl w:val="0"/>
+          <w:numId w:val="1003"/>
+        </w:numPr>
+      </w:pPr>
+      <w:r>
+        <w:t xml:space="preserve">shared_teams</w:t>
+      </w:r>
+      <w:r>
+        <w:br/>
+      </w:r>
+    </w:p>
+    <w:p>
+      <w:pPr>
+        <w:pStyle w:val="Compact"/>
+        <w:numPr>
+          <w:ilvl w:val="0"/>
+          <w:numId w:val="1003"/>
+        </w:numPr>
+      </w:pPr>
+      <w:r>
+        <w:t xml:space="preserve">shared_office365groups</w:t>
+      </w:r>
+      <w:r>
+        <w:br/>
+      </w:r>
+    </w:p>
+    <w:p>
+      <w:pPr>
+        <w:pStyle w:val="Compact"/>
+        <w:numPr>
+          <w:ilvl w:val="0"/>
+          <w:numId w:val="1003"/>
+        </w:numPr>
+      </w:pPr>
+      <w:r>
+        <w:t xml:space="preserve">shared_office365users</w:t>
+      </w:r>
+      <w:r>
+        <w:br/>
+      </w:r>
+      <w:r>
+        <w:t xml:space="preserve">(Identified across workflows)</w:t>
       </w:r>
     </w:p>
     <w:bookmarkEnd w:id="10"/>
-    <w:bookmarkStart w:id="11" w:name="X9f14f692452f04c4889a49c35c859e836638221"/>
+    <w:bookmarkStart w:id="11" w:name="workflows-list"/>
     <w:p>
       <w:pPr>
         <w:pStyle w:val="Heading2"/>
       </w:pPr>
       <w:r>
-        <w:t xml:space="preserve">Environment variables (names) — source: envvars.json</w:t>
-      </w:r>
-    </w:p>
-    <w:p>
-      <w:pPr>
-        <w:pStyle w:val="Compact"/>
-        <w:numPr>
-          <w:ilvl w:val="0"/>
-          <w:numId w:val="1003"/>
-        </w:numPr>
-      </w:pPr>
-      <w:r>
-        <w:t xml:space="preserve">wmreply_Replybrary_Admin_List/</w:t>
-      </w:r>
-      <w:r>
-        <w:br/>
-      </w:r>
-    </w:p>
-    <w:p>
-      <w:pPr>
-        <w:pStyle w:val="Compact"/>
-        <w:numPr>
-          <w:ilvl w:val="0"/>
-          <w:numId w:val="1003"/>
-        </w:numPr>
-      </w:pPr>
-      <w:r>
-        <w:t xml:space="preserve">wmreply_Replybrary_App_Link/</w:t>
-      </w:r>
-      <w:r>
-        <w:br/>
-      </w:r>
-    </w:p>
-    <w:p>
-      <w:pPr>
-        <w:pStyle w:val="Compact"/>
-        <w:numPr>
-          <w:ilvl w:val="0"/>
-          <w:numId w:val="1003"/>
-        </w:numPr>
-      </w:pPr>
-      <w:r>
-        <w:t xml:space="preserve">wmreply_Replybrary_CertificationsTracker_List/</w:t>
-      </w:r>
-      <w:r>
-        <w:br/>
-      </w:r>
-    </w:p>
-    <w:p>
-      <w:pPr>
-        <w:pStyle w:val="Compact"/>
-        <w:numPr>
-          <w:ilvl w:val="0"/>
-          <w:numId w:val="1003"/>
-        </w:numPr>
-      </w:pPr>
-      <w:r>
-        <w:t xml:space="preserve">wmreply_Replybrary_ClientContacts_List/</w:t>
-      </w:r>
-      <w:r>
-        <w:br/>
-      </w:r>
-    </w:p>
-    <w:p>
-      <w:pPr>
-        <w:pStyle w:val="Compact"/>
-        <w:numPr>
-          <w:ilvl w:val="0"/>
-          <w:numId w:val="1003"/>
-        </w:numPr>
-      </w:pPr>
-      <w:r>
-        <w:t xml:space="preserve">wmreply_Replybrary_Client_List/</w:t>
-      </w:r>
-      <w:r>
-        <w:br/>
-      </w:r>
-    </w:p>
-    <w:p>
-      <w:pPr>
-        <w:pStyle w:val="Compact"/>
-        <w:numPr>
-          <w:ilvl w:val="0"/>
-          <w:numId w:val="1003"/>
-        </w:numPr>
-      </w:pPr>
-      <w:r>
-        <w:t xml:space="preserve">wmreply_Replybrary_Currency_List/</w:t>
-      </w:r>
-      <w:r>
-        <w:br/>
-      </w:r>
-    </w:p>
-    <w:p>
-      <w:pPr>
-        <w:pStyle w:val="Compact"/>
-        <w:numPr>
-          <w:ilvl w:val="0"/>
-          <w:numId w:val="1003"/>
-        </w:numPr>
-      </w:pPr>
-      <w:r>
-        <w:t xml:space="preserve">wmreply_Replybrary_LessonsLearnt_List/</w:t>
-      </w:r>
-      <w:r>
-        <w:br/>
-      </w:r>
-    </w:p>
-    <w:p>
-      <w:pPr>
-        <w:pStyle w:val="Compact"/>
-        <w:numPr>
-          <w:ilvl w:val="0"/>
-          <w:numId w:val="1003"/>
-        </w:numPr>
-      </w:pPr>
-      <w:r>
-        <w:t xml:space="preserve">wmreply_Replybrary_Links_List/</w:t>
-      </w:r>
-      <w:r>
-        <w:br/>
-      </w:r>
-    </w:p>
-    <w:p>
-      <w:pPr>
-        <w:pStyle w:val="Compact"/>
-        <w:numPr>
-          <w:ilvl w:val="0"/>
-          <w:numId w:val="1003"/>
-        </w:numPr>
-      </w:pPr>
-      <w:r>
-        <w:t xml:space="preserve">wmreply_Replybrary_M365GroupID/</w:t>
-      </w:r>
-      <w:r>
-        <w:br/>
-      </w:r>
-    </w:p>
-    <w:p>
-      <w:pPr>
-        <w:pStyle w:val="Compact"/>
-        <w:numPr>
-          <w:ilvl w:val="0"/>
-          <w:numId w:val="1003"/>
-        </w:numPr>
-      </w:pPr>
-      <w:r>
-        <w:t xml:space="preserve">wmreply_Replybrary_People_List/</w:t>
-      </w:r>
-      <w:r>
-        <w:br/>
-      </w:r>
-    </w:p>
-    <w:p>
-      <w:pPr>
-        <w:pStyle w:val="Compact"/>
-        <w:numPr>
-          <w:ilvl w:val="0"/>
-          <w:numId w:val="1003"/>
-        </w:numPr>
-      </w:pPr>
-      <w:r>
-        <w:t xml:space="preserve">wmreply_Replybrary_ProjectHistory_List/</w:t>
-      </w:r>
-      <w:r>
-        <w:br/>
-      </w:r>
-    </w:p>
-    <w:p>
-      <w:pPr>
-        <w:pStyle w:val="Compact"/>
-        <w:numPr>
-          <w:ilvl w:val="0"/>
-          <w:numId w:val="1003"/>
-        </w:numPr>
-      </w:pPr>
-      <w:r>
-        <w:t xml:space="preserve">wmreply_Replybrary_Project_List/</w:t>
-      </w:r>
-      <w:r>
-        <w:br/>
-      </w:r>
-    </w:p>
-    <w:p>
-      <w:pPr>
-        <w:pStyle w:val="Compact"/>
-        <w:numPr>
-          <w:ilvl w:val="0"/>
-          <w:numId w:val="1003"/>
-        </w:numPr>
-      </w:pPr>
-      <w:r>
-        <w:t xml:space="preserve">wmreply_Replybrary_ReusableIdeas_List/</w:t>
-      </w:r>
-      <w:r>
-        <w:br/>
-      </w:r>
-    </w:p>
-    <w:p>
-      <w:pPr>
-        <w:pStyle w:val="Compact"/>
-        <w:numPr>
-          <w:ilvl w:val="0"/>
-          <w:numId w:val="1003"/>
-        </w:numPr>
-      </w:pPr>
-      <w:r>
-        <w:t xml:space="preserve">wmreply_Replybrary_SkillLevels_List/</w:t>
-      </w:r>
-      <w:r>
-        <w:br/>
-      </w:r>
-    </w:p>
-    <w:p>
-      <w:pPr>
-        <w:pStyle w:val="Compact"/>
-        <w:numPr>
-          <w:ilvl w:val="0"/>
-          <w:numId w:val="1003"/>
-        </w:numPr>
-      </w:pPr>
-      <w:r>
-        <w:t xml:space="preserve">wmreply_Replybrary_SMEs_List/</w:t>
-      </w:r>
-      <w:r>
-        <w:br/>
-      </w:r>
-    </w:p>
-    <w:p>
-      <w:pPr>
-        <w:pStyle w:val="Compact"/>
-        <w:numPr>
-          <w:ilvl w:val="0"/>
-          <w:numId w:val="1003"/>
-        </w:numPr>
-      </w:pPr>
-      <w:r>
-        <w:t xml:space="preserve">wmreply_Replybrary_SP_Site/</w:t>
+        <w:t xml:space="preserve">Workflows (list)</w:t>
+      </w:r>
+    </w:p>
+    <w:p>
+      <w:pPr>
+        <w:pStyle w:val="Compact"/>
+        <w:numPr>
+          <w:ilvl w:val="0"/>
+          <w:numId w:val="1004"/>
+        </w:numPr>
+      </w:pPr>
+      <w:r>
+        <w:t xml:space="preserve">EndFormFlow-82921763-2342-F011-8779-000D3A0CEB69</w:t>
+      </w:r>
+      <w:r>
+        <w:br/>
+      </w:r>
+    </w:p>
+    <w:p>
+      <w:pPr>
+        <w:pStyle w:val="Compact"/>
+        <w:numPr>
+          <w:ilvl w:val="0"/>
+          <w:numId w:val="1004"/>
+        </w:numPr>
+      </w:pPr>
+      <w:r>
+        <w:t xml:space="preserve">EndFormFlowReminder-128F82AA-B942-F011-877A-000D3A0CEB69</w:t>
+      </w:r>
+      <w:r>
+        <w:br/>
+      </w:r>
+    </w:p>
+    <w:p>
+      <w:pPr>
+        <w:pStyle w:val="Compact"/>
+        <w:numPr>
+          <w:ilvl w:val="0"/>
+          <w:numId w:val="1004"/>
+        </w:numPr>
+      </w:pPr>
+      <w:r>
+        <w:t xml:space="preserve">IdentifierReminderFlow-D4AE74B0-DA42-F011-877A-000D3A0CEB69</w:t>
+      </w:r>
+      <w:r>
+        <w:br/>
+      </w:r>
+    </w:p>
+    <w:p>
+      <w:pPr>
+        <w:pStyle w:val="Compact"/>
+        <w:numPr>
+          <w:ilvl w:val="0"/>
+          <w:numId w:val="1004"/>
+        </w:numPr>
+      </w:pPr>
+      <w:r>
+        <w:t xml:space="preserve">PeopleListFlow-3CE0853C-4C36-F011-8C4C-6045BD0ACADB</w:t>
+      </w:r>
+      <w:r>
+        <w:br/>
+      </w:r>
+    </w:p>
+    <w:p>
+      <w:pPr>
+        <w:pStyle w:val="Compact"/>
+        <w:numPr>
+          <w:ilvl w:val="0"/>
+          <w:numId w:val="1004"/>
+        </w:numPr>
+      </w:pPr>
+      <w:r>
+        <w:t xml:space="preserve">PMflow-A3194D5E-D434-F011-8C4C-6045BD0ACADB</w:t>
+      </w:r>
+      <w:r>
+        <w:br/>
+      </w:r>
+    </w:p>
+    <w:p>
+      <w:pPr>
+        <w:pStyle w:val="Compact"/>
+        <w:numPr>
+          <w:ilvl w:val="0"/>
+          <w:numId w:val="1004"/>
+        </w:numPr>
+      </w:pPr>
+      <w:r>
+        <w:t xml:space="preserve">PMFormReminderFlow-B025C04D-D342-F011-877A-000D3A0CEB69</w:t>
+      </w:r>
+      <w:r>
+        <w:br/>
+      </w:r>
+    </w:p>
+    <w:p>
+      <w:pPr>
+        <w:pStyle w:val="Compact"/>
+        <w:numPr>
+          <w:ilvl w:val="0"/>
+          <w:numId w:val="1004"/>
+        </w:numPr>
+      </w:pPr>
+      <w:r>
+        <w:t xml:space="preserve">ReplybraryDailyPipedrivecheck-5898F434-A147-F011-8779-000D3A0CEB69</w:t>
+      </w:r>
+      <w:r>
+        <w:br/>
+      </w:r>
+    </w:p>
+    <w:p>
+      <w:pPr>
+        <w:pStyle w:val="Compact"/>
+        <w:numPr>
+          <w:ilvl w:val="0"/>
+          <w:numId w:val="1004"/>
+        </w:numPr>
+      </w:pPr>
+      <w:r>
+        <w:t xml:space="preserve">Replybrary_GetExchangeRate-4E437A2B-C74D-F011-877B-000D3A0CEB69</w:t>
+      </w:r>
+      <w:r>
+        <w:br/>
+      </w:r>
+    </w:p>
+    <w:p>
+      <w:pPr>
+        <w:pStyle w:val="Compact"/>
+        <w:numPr>
+          <w:ilvl w:val="0"/>
+          <w:numId w:val="1004"/>
+        </w:numPr>
+      </w:pPr>
+      <w:r>
+        <w:t xml:space="preserve">Replybrary_Identifier_Flow-38CA161E-BA34-F011-8C4C-6045BD0ACADB</w:t>
+      </w:r>
+      <w:r>
+        <w:br/>
+      </w:r>
+    </w:p>
+    <w:p>
+      <w:pPr>
+        <w:pStyle w:val="Compact"/>
+        <w:numPr>
+          <w:ilvl w:val="0"/>
+          <w:numId w:val="1004"/>
+        </w:numPr>
+      </w:pPr>
+      <w:r>
+        <w:t xml:space="preserve">UploadLogo-F9309D25-C742-F011-877A-000D3A0CEB69</w:t>
+      </w:r>
+      <w:r>
+        <w:br/>
+      </w:r>
+      <w:r>
+        <w:t xml:space="preserve">(From workflows details)</w:t>
       </w:r>
     </w:p>
     <w:bookmarkEnd w:id="11"/>
-    <w:bookmarkStart w:id="12" w:name="X3b69630ca04a98352a2bd2fac4b913e69779551"/>
+    <w:bookmarkStart w:id="12" w:name="environment-variable-names"/>
     <w:p>
       <w:pPr>
         <w:pStyle w:val="Heading2"/>
       </w:pPr>
       <w:r>
-        <w:t xml:space="preserve">Canvas app groups (2) — source: canvasapps.json</w:t>
-      </w:r>
-    </w:p>
-    <w:p>
-      <w:pPr>
-        <w:pStyle w:val="Compact"/>
-        <w:numPr>
-          <w:ilvl w:val="0"/>
-          <w:numId w:val="1004"/>
-        </w:numPr>
-      </w:pPr>
-      <w:r>
-        <w:t xml:space="preserve">wmreply_replybraryv2_c933c</w:t>
-      </w:r>
-      <w:r>
-        <w:br/>
-      </w:r>
-    </w:p>
-    <w:p>
-      <w:pPr>
-        <w:pStyle w:val="Compact"/>
-        <w:numPr>
-          <w:ilvl w:val="0"/>
-          <w:numId w:val="1004"/>
-        </w:numPr>
-      </w:pPr>
-      <w:r>
-        <w:t xml:space="preserve">wmreply_replybrary_b320d</w:t>
+        <w:t xml:space="preserve">Environment variable names</w:t>
+      </w:r>
+    </w:p>
+    <w:p>
+      <w:pPr>
+        <w:pStyle w:val="Compact"/>
+        <w:numPr>
+          <w:ilvl w:val="0"/>
+          <w:numId w:val="1005"/>
+        </w:numPr>
+      </w:pPr>
+      <w:r>
+        <w:t xml:space="preserve">wmreply_Replybrary_Admin_List</w:t>
+      </w:r>
+      <w:r>
+        <w:br/>
+      </w:r>
+    </w:p>
+    <w:p>
+      <w:pPr>
+        <w:pStyle w:val="Compact"/>
+        <w:numPr>
+          <w:ilvl w:val="0"/>
+          <w:numId w:val="1005"/>
+        </w:numPr>
+      </w:pPr>
+      <w:r>
+        <w:t xml:space="preserve">wmreply_Replybrary_App_Link</w:t>
+      </w:r>
+      <w:r>
+        <w:br/>
+      </w:r>
+    </w:p>
+    <w:p>
+      <w:pPr>
+        <w:pStyle w:val="Compact"/>
+        <w:numPr>
+          <w:ilvl w:val="0"/>
+          <w:numId w:val="1005"/>
+        </w:numPr>
+      </w:pPr>
+      <w:r>
+        <w:t xml:space="preserve">wmreply_Replybrary_CertificationsTracker_List</w:t>
+      </w:r>
+      <w:r>
+        <w:br/>
+      </w:r>
+    </w:p>
+    <w:p>
+      <w:pPr>
+        <w:pStyle w:val="Compact"/>
+        <w:numPr>
+          <w:ilvl w:val="0"/>
+          <w:numId w:val="1005"/>
+        </w:numPr>
+      </w:pPr>
+      <w:r>
+        <w:t xml:space="preserve">wmreply_Replybrary_ClientContacts_List</w:t>
+      </w:r>
+      <w:r>
+        <w:br/>
+      </w:r>
+    </w:p>
+    <w:p>
+      <w:pPr>
+        <w:pStyle w:val="Compact"/>
+        <w:numPr>
+          <w:ilvl w:val="0"/>
+          <w:numId w:val="1005"/>
+        </w:numPr>
+      </w:pPr>
+      <w:r>
+        <w:t xml:space="preserve">wmreply_Replybrary_Client_List</w:t>
+      </w:r>
+      <w:r>
+        <w:br/>
+      </w:r>
+    </w:p>
+    <w:p>
+      <w:pPr>
+        <w:pStyle w:val="Compact"/>
+        <w:numPr>
+          <w:ilvl w:val="0"/>
+          <w:numId w:val="1005"/>
+        </w:numPr>
+      </w:pPr>
+      <w:r>
+        <w:t xml:space="preserve">wmreply_Replybrary_Currency_List</w:t>
+      </w:r>
+      <w:r>
+        <w:br/>
+      </w:r>
+    </w:p>
+    <w:p>
+      <w:pPr>
+        <w:pStyle w:val="Compact"/>
+        <w:numPr>
+          <w:ilvl w:val="0"/>
+          <w:numId w:val="1005"/>
+        </w:numPr>
+      </w:pPr>
+      <w:r>
+        <w:t xml:space="preserve">wmreply_Replybrary_LessonsLearnt_List</w:t>
+      </w:r>
+      <w:r>
+        <w:br/>
+      </w:r>
+    </w:p>
+    <w:p>
+      <w:pPr>
+        <w:pStyle w:val="Compact"/>
+        <w:numPr>
+          <w:ilvl w:val="0"/>
+          <w:numId w:val="1005"/>
+        </w:numPr>
+      </w:pPr>
+      <w:r>
+        <w:t xml:space="preserve">wmreply_Replybrary_Links_List</w:t>
+      </w:r>
+      <w:r>
+        <w:br/>
+      </w:r>
+    </w:p>
+    <w:p>
+      <w:pPr>
+        <w:pStyle w:val="Compact"/>
+        <w:numPr>
+          <w:ilvl w:val="0"/>
+          <w:numId w:val="1005"/>
+        </w:numPr>
+      </w:pPr>
+      <w:r>
+        <w:t xml:space="preserve">wmreply_Replybrary_M365GroupID</w:t>
+      </w:r>
+      <w:r>
+        <w:br/>
+      </w:r>
+    </w:p>
+    <w:p>
+      <w:pPr>
+        <w:pStyle w:val="Compact"/>
+        <w:numPr>
+          <w:ilvl w:val="0"/>
+          <w:numId w:val="1005"/>
+        </w:numPr>
+      </w:pPr>
+      <w:r>
+        <w:t xml:space="preserve">wmreply_Replybrary_People_List</w:t>
+      </w:r>
+      <w:r>
+        <w:br/>
+      </w:r>
+    </w:p>
+    <w:p>
+      <w:pPr>
+        <w:pStyle w:val="Compact"/>
+        <w:numPr>
+          <w:ilvl w:val="0"/>
+          <w:numId w:val="1005"/>
+        </w:numPr>
+      </w:pPr>
+      <w:r>
+        <w:t xml:space="preserve">wmreply_Replybrary_ProjectHistory_List</w:t>
+      </w:r>
+      <w:r>
+        <w:br/>
+      </w:r>
+    </w:p>
+    <w:p>
+      <w:pPr>
+        <w:pStyle w:val="Compact"/>
+        <w:numPr>
+          <w:ilvl w:val="0"/>
+          <w:numId w:val="1005"/>
+        </w:numPr>
+      </w:pPr>
+      <w:r>
+        <w:t xml:space="preserve">wmreply_Replybrary_Project_List</w:t>
+      </w:r>
+      <w:r>
+        <w:br/>
+      </w:r>
+    </w:p>
+    <w:p>
+      <w:pPr>
+        <w:pStyle w:val="Compact"/>
+        <w:numPr>
+          <w:ilvl w:val="0"/>
+          <w:numId w:val="1005"/>
+        </w:numPr>
+      </w:pPr>
+      <w:r>
+        <w:t xml:space="preserve">wmreply_Replybrary_ReusableIdeas_List</w:t>
+      </w:r>
+      <w:r>
+        <w:br/>
+      </w:r>
+    </w:p>
+    <w:p>
+      <w:pPr>
+        <w:pStyle w:val="Compact"/>
+        <w:numPr>
+          <w:ilvl w:val="0"/>
+          <w:numId w:val="1005"/>
+        </w:numPr>
+      </w:pPr>
+      <w:r>
+        <w:t xml:space="preserve">wmreply_Replybrary_SkillLevels_List</w:t>
+      </w:r>
+      <w:r>
+        <w:br/>
+      </w:r>
+    </w:p>
+    <w:p>
+      <w:pPr>
+        <w:pStyle w:val="Compact"/>
+        <w:numPr>
+          <w:ilvl w:val="0"/>
+          <w:numId w:val="1005"/>
+        </w:numPr>
+      </w:pPr>
+      <w:r>
+        <w:t xml:space="preserve">wmreply_Replybrary_SMEs_List</w:t>
+      </w:r>
+      <w:r>
+        <w:br/>
+      </w:r>
+    </w:p>
+    <w:p>
+      <w:pPr>
+        <w:pStyle w:val="Compact"/>
+        <w:numPr>
+          <w:ilvl w:val="0"/>
+          <w:numId w:val="1005"/>
+        </w:numPr>
+      </w:pPr>
+      <w:r>
+        <w:t xml:space="preserve">wmreply_Replybrary_SP_Site</w:t>
+      </w:r>
+      <w:r>
+        <w:br/>
+      </w:r>
+      <w:r>
+        <w:t xml:space="preserve">(From environment variable definitions)</w:t>
       </w:r>
     </w:p>
     <w:bookmarkEnd w:id="12"/>
+    <w:bookmarkStart w:id="13" w:name="screens-per-canvas-app"/>
+    <w:p>
+      <w:pPr>
+        <w:pStyle w:val="Heading2"/>
+      </w:pPr>
+      <w:r>
+        <w:t xml:space="preserve">Screens per canvas app</w:t>
+      </w:r>
+    </w:p>
+    <w:p>
+      <w:pPr>
+        <w:pStyle w:val="Compact"/>
+        <w:numPr>
+          <w:ilvl w:val="0"/>
+          <w:numId w:val="1006"/>
+        </w:numPr>
+      </w:pPr>
+      <w:r>
+        <w:t xml:space="preserve">wmreply_replybraryv2_c933c: none detected (screens array empty)</w:t>
+      </w:r>
+      <w:r>
+        <w:br/>
+      </w:r>
+    </w:p>
+    <w:p>
+      <w:pPr>
+        <w:pStyle w:val="Compact"/>
+        <w:numPr>
+          <w:ilvl w:val="0"/>
+          <w:numId w:val="1006"/>
+        </w:numPr>
+      </w:pPr>
+      <w:r>
+        <w:t xml:space="preserve">wmreply_replybrary_b320d: none detected (screens array empty)</w:t>
+      </w:r>
+    </w:p>
+    <w:p>
+      <w:pPr>
+        <w:pStyle w:val="FirstParagraph"/>
+      </w:pPr>
+      <w:r>
+        <w:t xml:space="preserve">Notes: counts and top-level totals are taken from the extracted overview and relationships data; workflow details and connector usage come from the workflows metadata.</w:t>
+      </w:r>
+    </w:p>
     <w:bookmarkEnd w:id="13"/>
+    <w:bookmarkEnd w:id="14"/>
     <w:sectPr>
       <w:footnotePr>
         <w:numRestart w:val="eachSect"/>
@@ -757,6 +907,12 @@
     <w:abstractNumId w:val="991"/>
   </w:num>
   <w:num w:numId="1004">
+    <w:abstractNumId w:val="991"/>
+  </w:num>
+  <w:num w:numId="1005">
+    <w:abstractNumId w:val="991"/>
+  </w:num>
+  <w:num w:numId="1006">
     <w:abstractNumId w:val="991"/>
   </w:num>
 </w:numbering>

</xml_diff>